<commit_message>
Add my ethics paragraphs and About Me, plus Yasmin and Alison sections
</commit_message>
<xml_diff>
--- a/ai_ethics.docx
+++ b/ai_ethics.docx
@@ -17,7 +17,7 @@
     </w:p>
     <w:p>
       <w:r>
-        <w:t>AI used for responses: Claude (Anthropic), October 27, 2026</w:t>
+        <w:t>AI used for responses: Claude (Anthropic), October 29, 2026</w:t>
       </w:r>
     </w:p>
     <w:p>
@@ -30,7 +30,7 @@
     </w:p>
     <w:p>
       <w:r>
-        <w:t>Using AI correctly in college means treating it as a tutor that supports learning instead of a shortcut that replaces it. Students can ask AI to explain a confusing concept in simpler words, generate practice questions before an exam, or point out grammar mistakes in a draft they already wrote. Before using AI on any assignment, a student should check the syllabus and follow the instructor's rules, because every class is different. When AI does help, the student should cite which tool was used and how it was used, just like any other source. Students should also double-check AI answers against the textbook or lecture notes, since AI can be confidently wrong. The ideas, analysis, and final wording that a student submits should reflect their own understanding. Used this way, AI makes students stronger learners while keeping the Aggie Honor Code intact.</w:t>
+        <w:t>Properly using AI in college as a learning aid. Students can use AI to clarify concepts they are confused about, create practice problems, and identify grammar issues in a written piece they have created. However, students should always check the syllabus and instructor guidelines before using it on assignments. Each class is different and students should always follow their guidelines. If students do use AI, they should properly cite which tool they used and how they used it. Students should also verify the answers they receive from AI by checking your textbook or lecture notes. AI can be very confidently incorrect. Overall, students’ ideas, analysis, and final product should be their own understanding.</w:t>
       </w:r>
     </w:p>
     <w:p>
@@ -49,7 +49,7 @@
         <w:t xml:space="preserve">AI Response: </w:t>
       </w:r>
       <w:r>
-        <w:t>Yes, I agree. Your paragraph captures the key idea that AI should support learning rather than replace it. Checking each syllabus is an important point, since acceptable AI use really does vary between courses and even between assignments. Citing the tool and verifying its output are both strong habits, because AI can produce errors or made-up details that sound convincing. One thing you could add is that students should be careful about what personal or confidential information they paste into AI tools. Overall, this is a balanced and honest description of responsible AI use in college.</w:t>
+        <w:t>Yes, I agree with your paragraph. You describe AI as a learning aid rather than a replacement for learning, and the examples you give (clarifying concepts, practice problems, and grammar checks) are good ways to use it. Checking the syllabus first is an important point, since rules really do change from class to class. Citing the tool and verifying answers against the textbook are strong habits, and you are right that AI can sound confident while being wrong. Two small writing notes: the first sentence is missing a verb (for example, "Properly using AI in college means using it as a learning aid"), and "your textbook" switches from "students" to "you." Overall, this is a clear and honest description of responsible AI use.</w:t>
       </w:r>
     </w:p>
     <w:p>
@@ -62,7 +62,7 @@
     </w:p>
     <w:p>
       <w:r>
-        <w:t>Using AI incorrectly in college means letting it do the thinking and then presenting the result as your own work. A common example is asking AI to write an entire essay or discussion post and submitting it without citing it. Another is using AI during a quiz or exam when the instructor has not allowed it, which is the same as cheating. Some students copy AI-generated sources into a bibliography without checking them, even though AI sometimes invents articles that do not exist. Others paste AI code into a programming assignment without understanding how it works. These choices may save time in the moment, but they leave the student without the skills the course was meant to build. They also violate the Aggie Honor Code, because Aggies do not lie, cheat, or steal, and passing off AI work as your own is all three.</w:t>
+        <w:t>Misusing AI in college can be done by having AI think for you. Common examples of this would be using AI to generate an essay or discussion board from start to finish and not citing the source. Using AI during a quiz or test when the instructor hasn’t allowed it is also cheating. Some students will copy AI generated sources into their bibliography without verifying them. Sometimes AI will create fake articles. Students will also copy and paste code from AI into their programming assignment. This can cause issues as you aren’t learning the skills that the course is trying to teach you.</w:t>
       </w:r>
     </w:p>
     <w:p>
@@ -81,7 +81,7 @@
         <w:t xml:space="preserve">AI Response: </w:t>
       </w:r>
       <w:r>
-        <w:t>Yes, I agree. You clearly identify the main forms of AI misuse: uncited ghostwriting, unauthorized use during exams, fabricated citations, and submitting code you do not understand. The point about fake sources is especially important, because AI models can generate realistic-looking references that are not real. Your strongest argument is that misuse hurts the student most, since they miss the learning the course was designed to provide. The connection to the Aggie Honor Code ties it together well. The core message is accurate: the problem is not using AI, it is hiding it or letting it replace your own work.</w:t>
+        <w:t>Yes, I agree. Your paragraph names the most common ways students misuse AI: having it write full assignments without citing it, using it on quizzes or tests when it is not allowed, adding unverified sources, and copying code. The point about fake articles is especially important, because AI can produce references that look real but do not exist. Your last sentence makes the strongest argument: misuse hurts the student most because they miss the skills the course is meant to teach. You could make it even stronger by connecting it to academic integrity and the Aggie Honor Code, since presenting AI work as your own is a form of dishonesty.</w:t>
       </w:r>
     </w:p>
     <w:p>

</xml_diff>

<commit_message>
Remove section C from ethics documents
</commit_message>
<xml_diff>
--- a/ai_ethics.docx
+++ b/ai_ethics.docx
@@ -82,19 +82,6 @@
       </w:r>
       <w:r>
         <w:t>Yes, I agree. Your paragraph names the most common ways students misuse AI: having it write full assignments without citing it, using it on quizzes or tests when it is not allowed, adding unverified sources, and copying code. The point about fake articles is especially important, because AI can produce references that look real but do not exist. Your last sentence makes the strongest argument: misuse hurts the student most because they miss the skills the course is meant to teach. You could make it even stronger by connecting it to academic integrity and the Aggie Honor Code, since presenting AI work as your own is a form of dishonesty.</w:t>
-      </w:r>
-    </w:p>
-    <w:p>
-      <w:pPr>
-        <w:pStyle w:val="Heading1"/>
-      </w:pPr>
-      <w:r>
-        <w:t>C: Converting This Document to PDF</w:t>
-      </w:r>
-    </w:p>
-    <w:p>
-      <w:r>
-        <w:t>In Microsoft Word, choose File &gt; Save As (or Export), pick PDF as the file type, and click Save. This produced ai_ethics.pdf from this document.</w:t>
       </w:r>
     </w:p>
     <w:sectPr>

</xml_diff>